<commit_message>
fixed arff error and one white space issues in the data file
</commit_message>
<xml_diff>
--- a/Exercise0/24_Vandák_Milic_Reiterer_Exercise0_Report.docx
+++ b/Exercise0/24_Vandák_Milic_Reiterer_Exercise0_Report.docx
@@ -4,7 +4,7 @@
   <w:body>
     <w:p>
       <w:pPr>
-        <w:pStyle w:val="Titel"/>
+        <w:pStyle w:val="Title"/>
         <w:rPr>
           <w:sz w:val="36"/>
           <w:szCs w:val="36"/>
@@ -30,7 +30,7 @@
     </w:p>
     <w:p>
       <w:pPr>
-        <w:pStyle w:val="berschrift1"/>
+        <w:pStyle w:val="Heading1"/>
         <w:rPr>
           <w:sz w:val="32"/>
           <w:szCs w:val="32"/>
@@ -129,7 +129,7 @@
     </w:p>
     <w:p>
       <w:pPr>
-        <w:pStyle w:val="berschrift1"/>
+        <w:pStyle w:val="Heading1"/>
         <w:rPr>
           <w:sz w:val="30"/>
           <w:szCs w:val="30"/>
@@ -281,7 +281,7 @@
     </w:p>
     <w:p>
       <w:pPr>
-        <w:pStyle w:val="berschrift2"/>
+        <w:pStyle w:val="Heading2"/>
         <w:rPr>
           <w:sz w:val="28"/>
           <w:szCs w:val="28"/>
@@ -425,7 +425,7 @@
     </w:p>
     <w:p>
       <w:pPr>
-        <w:pStyle w:val="berschrift2"/>
+        <w:pStyle w:val="Heading2"/>
         <w:spacing w:before="120"/>
         <w:rPr>
           <w:sz w:val="28"/>
@@ -603,7 +603,7 @@
     </w:p>
     <w:p>
       <w:pPr>
-        <w:pStyle w:val="berschrift2"/>
+        <w:pStyle w:val="Heading2"/>
         <w:rPr>
           <w:sz w:val="28"/>
           <w:szCs w:val="28"/>
@@ -848,7 +848,7 @@
     </w:p>
     <w:p>
       <w:pPr>
-        <w:pStyle w:val="berschrift1"/>
+        <w:pStyle w:val="Heading1"/>
         <w:rPr>
           <w:sz w:val="30"/>
           <w:szCs w:val="30"/>
@@ -1034,7 +1034,7 @@
     </w:p>
     <w:p>
       <w:pPr>
-        <w:pStyle w:val="berschrift2"/>
+        <w:pStyle w:val="Heading2"/>
         <w:rPr>
           <w:sz w:val="28"/>
           <w:szCs w:val="28"/>
@@ -1068,7 +1068,7 @@
     </w:p>
     <w:tbl>
       <w:tblPr>
-        <w:tblStyle w:val="Tabellenraster"/>
+        <w:tblStyle w:val="TableGrid"/>
         <w:tblW w:w="9209" w:type="dxa"/>
         <w:tblLayout w:type="fixed"/>
         <w:tblLook w:val="04A0" w:firstRow="1" w:lastRow="0" w:firstColumn="1" w:lastColumn="0" w:noHBand="0" w:noVBand="1"/>
@@ -1216,7 +1216,7 @@
           </w:tcPr>
           <w:tbl>
             <w:tblPr>
-              <w:tblStyle w:val="TabellemithellemGitternetz"/>
+              <w:tblStyle w:val="TableGridLight"/>
               <w:tblpPr w:leftFromText="141" w:rightFromText="141" w:vertAnchor="text" w:horzAnchor="margin" w:tblpY="53"/>
               <w:tblOverlap w:val="never"/>
               <w:tblW w:w="0" w:type="auto"/>
@@ -2021,7 +2021,7 @@
     </w:tbl>
     <w:p>
       <w:pPr>
-        <w:pStyle w:val="berschrift2"/>
+        <w:pStyle w:val="Heading2"/>
         <w:rPr>
           <w:sz w:val="28"/>
           <w:szCs w:val="28"/>
@@ -2148,7 +2148,7 @@
     </w:p>
     <w:p>
       <w:pPr>
-        <w:pStyle w:val="berschrift2"/>
+        <w:pStyle w:val="Heading2"/>
         <w:rPr>
           <w:sz w:val="28"/>
           <w:szCs w:val="28"/>
@@ -2505,7 +2505,7 @@
         </w:tcPr>
         <w:p>
           <w:pPr>
-            <w:pStyle w:val="Kopfzeile"/>
+            <w:pStyle w:val="Header"/>
             <w:ind w:left="-115"/>
           </w:pPr>
         </w:p>
@@ -2516,7 +2516,7 @@
         </w:tcPr>
         <w:p>
           <w:pPr>
-            <w:pStyle w:val="Kopfzeile"/>
+            <w:pStyle w:val="Header"/>
             <w:jc w:val="center"/>
           </w:pPr>
           <w:r>
@@ -2545,7 +2545,7 @@
         </w:tcPr>
         <w:p>
           <w:pPr>
-            <w:pStyle w:val="Kopfzeile"/>
+            <w:pStyle w:val="Header"/>
             <w:ind w:right="-115"/>
             <w:jc w:val="right"/>
           </w:pPr>
@@ -2555,7 +2555,7 @@
   </w:tbl>
   <w:p>
     <w:pPr>
-      <w:pStyle w:val="Fuzeile"/>
+      <w:pStyle w:val="Footer"/>
     </w:pPr>
   </w:p>
 </w:ftr>
@@ -2584,7 +2584,7 @@
 <w:hdr xmlns:wpc="http://schemas.microsoft.com/office/word/2010/wordprocessingCanvas" xmlns:cx="http://schemas.microsoft.com/office/drawing/2014/chartex" xmlns:cx1="http://schemas.microsoft.com/office/drawing/2015/9/8/chartex" xmlns:cx2="http://schemas.microsoft.com/office/drawing/2015/10/21/chartex" xmlns:cx3="http://schemas.microsoft.com/office/drawing/2016/5/9/chartex" xmlns:cx4="http://schemas.microsoft.com/office/drawing/2016/5/10/chartex" xmlns:cx5="http://schemas.microsoft.com/office/drawing/2016/5/11/chartex" xmlns:cx6="http://schemas.microsoft.com/office/drawing/2016/5/12/chartex" xmlns:cx7="http://schemas.microsoft.com/office/drawing/2016/5/13/chartex" xmlns:cx8="http://schemas.microsoft.com/office/drawing/2016/5/14/chartex" xmlns:mc="http://schemas.openxmlformats.org/markup-compatibility/2006" xmlns:aink="http://schemas.microsoft.com/office/drawing/2016/ink" xmlns:am3d="http://schemas.microsoft.com/office/drawing/2017/model3d" xmlns:o="urn:schemas-microsoft-com:office:office" xmlns:oel="http://schemas.microsoft.com/office/2019/extlst" xmlns:r="http://schemas.openxmlformats.org/officeDocument/2006/relationships" xmlns:m="http://schemas.openxmlformats.org/officeDocument/2006/math" xmlns:v="urn:schemas-microsoft-com:vml" xmlns:wp14="http://schemas.microsoft.com/office/word/2010/wordprocessingDrawing" xmlns:wp="http://schemas.openxmlformats.org/drawingml/2006/wordprocessingDrawing" xmlns:w10="urn:schemas-microsoft-com:office:word" xmlns:w="http://schemas.openxmlformats.org/wordprocessingml/2006/main" xmlns:w14="http://schemas.microsoft.com/office/word/2010/wordml" xmlns:w15="http://schemas.microsoft.com/office/word/2012/wordml" xmlns:w16cex="http://schemas.microsoft.com/office/word/2018/wordml/cex" xmlns:w16cid="http://schemas.microsoft.com/office/word/2016/wordml/cid" xmlns:w16="http://schemas.microsoft.com/office/word/2018/wordml" xmlns:w16du="http://schemas.microsoft.com/office/word/2023/wordml/word16du" xmlns:w16sdtdh="http://schemas.microsoft.com/office/word/2020/wordml/sdtdatahash" xmlns:w16sdtfl="http://schemas.microsoft.com/office/word/2024/wordml/sdtformatlock" xmlns:w16se="http://schemas.microsoft.com/office/word/2015/wordml/symex" xmlns:wpg="http://schemas.microsoft.com/office/word/2010/wordprocessingGroup" xmlns:wpi="http://schemas.microsoft.com/office/word/2010/wordprocessingInk" xmlns:wne="http://schemas.microsoft.com/office/word/2006/wordml" xmlns:wps="http://schemas.microsoft.com/office/word/2010/wordprocessingShape" mc:Ignorable="w14 w15 w16se w16cid w16 w16cex w16sdtdh w16sdtfl w16du wp14">
   <w:p>
     <w:pPr>
-      <w:pStyle w:val="Kopfzeile"/>
+      <w:pStyle w:val="Header"/>
     </w:pPr>
     <w:proofErr w:type="spellStart"/>
     <w:r>
@@ -3700,15 +3700,15 @@
     <w:lsdException w:name="Unresolved Mention" w:semiHidden="1" w:unhideWhenUsed="1"/>
     <w:lsdException w:name="Smart Link" w:semiHidden="1" w:unhideWhenUsed="1"/>
   </w:latentStyles>
-  <w:style w:type="paragraph" w:default="1" w:styleId="Standard">
+  <w:style w:type="paragraph" w:default="1" w:styleId="Normal">
     <w:name w:val="Normal"/>
     <w:qFormat/>
   </w:style>
-  <w:style w:type="paragraph" w:styleId="berschrift1">
+  <w:style w:type="paragraph" w:styleId="Heading1">
     <w:name w:val="heading 1"/>
-    <w:basedOn w:val="Standard"/>
-    <w:next w:val="Standard"/>
-    <w:link w:val="berschrift1Zchn"/>
+    <w:basedOn w:val="Normal"/>
+    <w:next w:val="Normal"/>
+    <w:link w:val="Heading1Char"/>
     <w:uiPriority w:val="9"/>
     <w:qFormat/>
     <w:rsid w:val="001C76E9"/>
@@ -3725,11 +3725,11 @@
       <w:szCs w:val="40"/>
     </w:rPr>
   </w:style>
-  <w:style w:type="paragraph" w:styleId="berschrift2">
+  <w:style w:type="paragraph" w:styleId="Heading2">
     <w:name w:val="heading 2"/>
-    <w:basedOn w:val="Standard"/>
-    <w:next w:val="Standard"/>
-    <w:link w:val="berschrift2Zchn"/>
+    <w:basedOn w:val="Normal"/>
+    <w:next w:val="Normal"/>
+    <w:link w:val="Heading2Char"/>
     <w:uiPriority w:val="9"/>
     <w:unhideWhenUsed/>
     <w:qFormat/>
@@ -3747,11 +3747,11 @@
       <w:szCs w:val="32"/>
     </w:rPr>
   </w:style>
-  <w:style w:type="paragraph" w:styleId="berschrift3">
+  <w:style w:type="paragraph" w:styleId="Heading3">
     <w:name w:val="heading 3"/>
-    <w:basedOn w:val="Standard"/>
-    <w:next w:val="Standard"/>
-    <w:link w:val="berschrift3Zchn"/>
+    <w:basedOn w:val="Normal"/>
+    <w:next w:val="Normal"/>
+    <w:link w:val="Heading3Char"/>
     <w:uiPriority w:val="9"/>
     <w:semiHidden/>
     <w:unhideWhenUsed/>
@@ -3770,11 +3770,11 @@
       <w:szCs w:val="28"/>
     </w:rPr>
   </w:style>
-  <w:style w:type="paragraph" w:styleId="berschrift4">
+  <w:style w:type="paragraph" w:styleId="Heading4">
     <w:name w:val="heading 4"/>
-    <w:basedOn w:val="Standard"/>
-    <w:next w:val="Standard"/>
-    <w:link w:val="berschrift4Zchn"/>
+    <w:basedOn w:val="Normal"/>
+    <w:next w:val="Normal"/>
+    <w:link w:val="Heading4Char"/>
     <w:uiPriority w:val="9"/>
     <w:semiHidden/>
     <w:unhideWhenUsed/>
@@ -3793,11 +3793,11 @@
       <w:color w:val="0F4761" w:themeColor="accent1" w:themeShade="BF"/>
     </w:rPr>
   </w:style>
-  <w:style w:type="paragraph" w:styleId="berschrift5">
+  <w:style w:type="paragraph" w:styleId="Heading5">
     <w:name w:val="heading 5"/>
-    <w:basedOn w:val="Standard"/>
-    <w:next w:val="Standard"/>
-    <w:link w:val="berschrift5Zchn"/>
+    <w:basedOn w:val="Normal"/>
+    <w:next w:val="Normal"/>
+    <w:link w:val="Heading5Char"/>
     <w:uiPriority w:val="9"/>
     <w:semiHidden/>
     <w:unhideWhenUsed/>
@@ -3814,11 +3814,11 @@
       <w:color w:val="0F4761" w:themeColor="accent1" w:themeShade="BF"/>
     </w:rPr>
   </w:style>
-  <w:style w:type="paragraph" w:styleId="berschrift6">
+  <w:style w:type="paragraph" w:styleId="Heading6">
     <w:name w:val="heading 6"/>
-    <w:basedOn w:val="Standard"/>
-    <w:next w:val="Standard"/>
-    <w:link w:val="berschrift6Zchn"/>
+    <w:basedOn w:val="Normal"/>
+    <w:next w:val="Normal"/>
+    <w:link w:val="Heading6Char"/>
     <w:uiPriority w:val="9"/>
     <w:semiHidden/>
     <w:unhideWhenUsed/>
@@ -3837,11 +3837,11 @@
       <w:color w:val="595959" w:themeColor="text1" w:themeTint="A6"/>
     </w:rPr>
   </w:style>
-  <w:style w:type="paragraph" w:styleId="berschrift7">
+  <w:style w:type="paragraph" w:styleId="Heading7">
     <w:name w:val="heading 7"/>
-    <w:basedOn w:val="Standard"/>
-    <w:next w:val="Standard"/>
-    <w:link w:val="berschrift7Zchn"/>
+    <w:basedOn w:val="Normal"/>
+    <w:next w:val="Normal"/>
+    <w:link w:val="Heading7Char"/>
     <w:uiPriority w:val="9"/>
     <w:semiHidden/>
     <w:unhideWhenUsed/>
@@ -3858,11 +3858,11 @@
       <w:color w:val="595959" w:themeColor="text1" w:themeTint="A6"/>
     </w:rPr>
   </w:style>
-  <w:style w:type="paragraph" w:styleId="berschrift8">
+  <w:style w:type="paragraph" w:styleId="Heading8">
     <w:name w:val="heading 8"/>
-    <w:basedOn w:val="Standard"/>
-    <w:next w:val="Standard"/>
-    <w:link w:val="berschrift8Zchn"/>
+    <w:basedOn w:val="Normal"/>
+    <w:next w:val="Normal"/>
+    <w:link w:val="Heading8Char"/>
     <w:uiPriority w:val="9"/>
     <w:semiHidden/>
     <w:unhideWhenUsed/>
@@ -3880,11 +3880,11 @@
       <w:color w:val="272727" w:themeColor="text1" w:themeTint="D8"/>
     </w:rPr>
   </w:style>
-  <w:style w:type="paragraph" w:styleId="berschrift9">
+  <w:style w:type="paragraph" w:styleId="Heading9">
     <w:name w:val="heading 9"/>
-    <w:basedOn w:val="Standard"/>
-    <w:next w:val="Standard"/>
-    <w:link w:val="berschrift9Zchn"/>
+    <w:basedOn w:val="Normal"/>
+    <w:next w:val="Normal"/>
+    <w:link w:val="Heading9Char"/>
     <w:uiPriority w:val="9"/>
     <w:semiHidden/>
     <w:unhideWhenUsed/>
@@ -3900,13 +3900,13 @@
       <w:color w:val="272727" w:themeColor="text1" w:themeTint="D8"/>
     </w:rPr>
   </w:style>
-  <w:style w:type="character" w:default="1" w:styleId="Absatz-Standardschriftart">
+  <w:style w:type="character" w:default="1" w:styleId="DefaultParagraphFont">
     <w:name w:val="Default Paragraph Font"/>
     <w:uiPriority w:val="1"/>
     <w:semiHidden/>
     <w:unhideWhenUsed/>
   </w:style>
-  <w:style w:type="table" w:default="1" w:styleId="NormaleTabelle">
+  <w:style w:type="table" w:default="1" w:styleId="TableNormal">
     <w:name w:val="Normal Table"/>
     <w:uiPriority w:val="99"/>
     <w:semiHidden/>
@@ -3921,16 +3921,16 @@
       </w:tblCellMar>
     </w:tblPr>
   </w:style>
-  <w:style w:type="numbering" w:default="1" w:styleId="KeineListe">
+  <w:style w:type="numbering" w:default="1" w:styleId="NoList">
     <w:name w:val="No List"/>
     <w:uiPriority w:val="99"/>
     <w:semiHidden/>
     <w:unhideWhenUsed/>
   </w:style>
-  <w:style w:type="character" w:customStyle="1" w:styleId="berschrift1Zchn">
-    <w:name w:val="Überschrift 1 Zchn"/>
-    <w:basedOn w:val="Absatz-Standardschriftart"/>
-    <w:link w:val="berschrift1"/>
+  <w:style w:type="character" w:customStyle="1" w:styleId="Heading1Char">
+    <w:name w:val="Heading 1 Char"/>
+    <w:basedOn w:val="DefaultParagraphFont"/>
+    <w:link w:val="Heading1"/>
     <w:uiPriority w:val="9"/>
     <w:rsid w:val="001C76E9"/>
     <w:rPr>
@@ -3940,10 +3940,10 @@
       <w:szCs w:val="40"/>
     </w:rPr>
   </w:style>
-  <w:style w:type="character" w:customStyle="1" w:styleId="berschrift2Zchn">
-    <w:name w:val="Überschrift 2 Zchn"/>
-    <w:basedOn w:val="Absatz-Standardschriftart"/>
-    <w:link w:val="berschrift2"/>
+  <w:style w:type="character" w:customStyle="1" w:styleId="Heading2Char">
+    <w:name w:val="Heading 2 Char"/>
+    <w:basedOn w:val="DefaultParagraphFont"/>
+    <w:link w:val="Heading2"/>
     <w:uiPriority w:val="9"/>
     <w:rsid w:val="001C76E9"/>
     <w:rPr>
@@ -3953,10 +3953,10 @@
       <w:szCs w:val="32"/>
     </w:rPr>
   </w:style>
-  <w:style w:type="character" w:customStyle="1" w:styleId="berschrift3Zchn">
-    <w:name w:val="Überschrift 3 Zchn"/>
-    <w:basedOn w:val="Absatz-Standardschriftart"/>
-    <w:link w:val="berschrift3"/>
+  <w:style w:type="character" w:customStyle="1" w:styleId="Heading3Char">
+    <w:name w:val="Heading 3 Char"/>
+    <w:basedOn w:val="DefaultParagraphFont"/>
+    <w:link w:val="Heading3"/>
     <w:uiPriority w:val="9"/>
     <w:semiHidden/>
     <w:rsid w:val="001C76E9"/>
@@ -3967,10 +3967,10 @@
       <w:szCs w:val="28"/>
     </w:rPr>
   </w:style>
-  <w:style w:type="character" w:customStyle="1" w:styleId="berschrift4Zchn">
-    <w:name w:val="Überschrift 4 Zchn"/>
-    <w:basedOn w:val="Absatz-Standardschriftart"/>
-    <w:link w:val="berschrift4"/>
+  <w:style w:type="character" w:customStyle="1" w:styleId="Heading4Char">
+    <w:name w:val="Heading 4 Char"/>
+    <w:basedOn w:val="DefaultParagraphFont"/>
+    <w:link w:val="Heading4"/>
     <w:uiPriority w:val="9"/>
     <w:semiHidden/>
     <w:rsid w:val="001C76E9"/>
@@ -3981,10 +3981,10 @@
       <w:color w:val="0F4761" w:themeColor="accent1" w:themeShade="BF"/>
     </w:rPr>
   </w:style>
-  <w:style w:type="character" w:customStyle="1" w:styleId="berschrift5Zchn">
-    <w:name w:val="Überschrift 5 Zchn"/>
-    <w:basedOn w:val="Absatz-Standardschriftart"/>
-    <w:link w:val="berschrift5"/>
+  <w:style w:type="character" w:customStyle="1" w:styleId="Heading5Char">
+    <w:name w:val="Heading 5 Char"/>
+    <w:basedOn w:val="DefaultParagraphFont"/>
+    <w:link w:val="Heading5"/>
     <w:uiPriority w:val="9"/>
     <w:semiHidden/>
     <w:rsid w:val="001C76E9"/>
@@ -3993,10 +3993,10 @@
       <w:color w:val="0F4761" w:themeColor="accent1" w:themeShade="BF"/>
     </w:rPr>
   </w:style>
-  <w:style w:type="character" w:customStyle="1" w:styleId="berschrift6Zchn">
-    <w:name w:val="Überschrift 6 Zchn"/>
-    <w:basedOn w:val="Absatz-Standardschriftart"/>
-    <w:link w:val="berschrift6"/>
+  <w:style w:type="character" w:customStyle="1" w:styleId="Heading6Char">
+    <w:name w:val="Heading 6 Char"/>
+    <w:basedOn w:val="DefaultParagraphFont"/>
+    <w:link w:val="Heading6"/>
     <w:uiPriority w:val="9"/>
     <w:semiHidden/>
     <w:rsid w:val="001C76E9"/>
@@ -4007,10 +4007,10 @@
       <w:color w:val="595959" w:themeColor="text1" w:themeTint="A6"/>
     </w:rPr>
   </w:style>
-  <w:style w:type="character" w:customStyle="1" w:styleId="berschrift7Zchn">
-    <w:name w:val="Überschrift 7 Zchn"/>
-    <w:basedOn w:val="Absatz-Standardschriftart"/>
-    <w:link w:val="berschrift7"/>
+  <w:style w:type="character" w:customStyle="1" w:styleId="Heading7Char">
+    <w:name w:val="Heading 7 Char"/>
+    <w:basedOn w:val="DefaultParagraphFont"/>
+    <w:link w:val="Heading7"/>
     <w:uiPriority w:val="9"/>
     <w:semiHidden/>
     <w:rsid w:val="001C76E9"/>
@@ -4019,10 +4019,10 @@
       <w:color w:val="595959" w:themeColor="text1" w:themeTint="A6"/>
     </w:rPr>
   </w:style>
-  <w:style w:type="character" w:customStyle="1" w:styleId="berschrift8Zchn">
-    <w:name w:val="Überschrift 8 Zchn"/>
-    <w:basedOn w:val="Absatz-Standardschriftart"/>
-    <w:link w:val="berschrift8"/>
+  <w:style w:type="character" w:customStyle="1" w:styleId="Heading8Char">
+    <w:name w:val="Heading 8 Char"/>
+    <w:basedOn w:val="DefaultParagraphFont"/>
+    <w:link w:val="Heading8"/>
     <w:uiPriority w:val="9"/>
     <w:semiHidden/>
     <w:rsid w:val="001C76E9"/>
@@ -4033,10 +4033,10 @@
       <w:color w:val="272727" w:themeColor="text1" w:themeTint="D8"/>
     </w:rPr>
   </w:style>
-  <w:style w:type="character" w:customStyle="1" w:styleId="berschrift9Zchn">
-    <w:name w:val="Überschrift 9 Zchn"/>
-    <w:basedOn w:val="Absatz-Standardschriftart"/>
-    <w:link w:val="berschrift9"/>
+  <w:style w:type="character" w:customStyle="1" w:styleId="Heading9Char">
+    <w:name w:val="Heading 9 Char"/>
+    <w:basedOn w:val="DefaultParagraphFont"/>
+    <w:link w:val="Heading9"/>
     <w:uiPriority w:val="9"/>
     <w:semiHidden/>
     <w:rsid w:val="001C76E9"/>
@@ -4045,11 +4045,11 @@
       <w:color w:val="272727" w:themeColor="text1" w:themeTint="D8"/>
     </w:rPr>
   </w:style>
-  <w:style w:type="paragraph" w:styleId="Titel">
+  <w:style w:type="paragraph" w:styleId="Title">
     <w:name w:val="Title"/>
-    <w:basedOn w:val="Standard"/>
-    <w:next w:val="Standard"/>
-    <w:link w:val="TitelZchn"/>
+    <w:basedOn w:val="Normal"/>
+    <w:next w:val="Normal"/>
+    <w:link w:val="TitleChar"/>
     <w:uiPriority w:val="10"/>
     <w:qFormat/>
     <w:rsid w:val="001C76E9"/>
@@ -4065,10 +4065,10 @@
       <w:szCs w:val="56"/>
     </w:rPr>
   </w:style>
-  <w:style w:type="character" w:customStyle="1" w:styleId="TitelZchn">
-    <w:name w:val="Titel Zchn"/>
-    <w:basedOn w:val="Absatz-Standardschriftart"/>
-    <w:link w:val="Titel"/>
+  <w:style w:type="character" w:customStyle="1" w:styleId="TitleChar">
+    <w:name w:val="Title Char"/>
+    <w:basedOn w:val="DefaultParagraphFont"/>
+    <w:link w:val="Title"/>
     <w:uiPriority w:val="10"/>
     <w:rsid w:val="001C76E9"/>
     <w:rPr>
@@ -4079,11 +4079,11 @@
       <w:szCs w:val="56"/>
     </w:rPr>
   </w:style>
-  <w:style w:type="paragraph" w:styleId="Untertitel">
+  <w:style w:type="paragraph" w:styleId="Subtitle">
     <w:name w:val="Subtitle"/>
-    <w:basedOn w:val="Standard"/>
-    <w:next w:val="Standard"/>
-    <w:link w:val="UntertitelZchn"/>
+    <w:basedOn w:val="Normal"/>
+    <w:next w:val="Normal"/>
+    <w:link w:val="SubtitleChar"/>
     <w:uiPriority w:val="11"/>
     <w:qFormat/>
     <w:rsid w:val="001C76E9"/>
@@ -4101,10 +4101,10 @@
       <w:szCs w:val="28"/>
     </w:rPr>
   </w:style>
-  <w:style w:type="character" w:customStyle="1" w:styleId="UntertitelZchn">
-    <w:name w:val="Untertitel Zchn"/>
-    <w:basedOn w:val="Absatz-Standardschriftart"/>
-    <w:link w:val="Untertitel"/>
+  <w:style w:type="character" w:customStyle="1" w:styleId="SubtitleChar">
+    <w:name w:val="Subtitle Char"/>
+    <w:basedOn w:val="DefaultParagraphFont"/>
+    <w:link w:val="Subtitle"/>
     <w:uiPriority w:val="11"/>
     <w:rsid w:val="001C76E9"/>
     <w:rPr>
@@ -4115,11 +4115,11 @@
       <w:szCs w:val="28"/>
     </w:rPr>
   </w:style>
-  <w:style w:type="paragraph" w:styleId="Zitat">
+  <w:style w:type="paragraph" w:styleId="Quote">
     <w:name w:val="Quote"/>
-    <w:basedOn w:val="Standard"/>
-    <w:next w:val="Standard"/>
-    <w:link w:val="ZitatZchn"/>
+    <w:basedOn w:val="Normal"/>
+    <w:next w:val="Normal"/>
+    <w:link w:val="QuoteChar"/>
     <w:uiPriority w:val="29"/>
     <w:qFormat/>
     <w:rsid w:val="001C76E9"/>
@@ -4133,10 +4133,10 @@
       <w:color w:val="404040" w:themeColor="text1" w:themeTint="BF"/>
     </w:rPr>
   </w:style>
-  <w:style w:type="character" w:customStyle="1" w:styleId="ZitatZchn">
-    <w:name w:val="Zitat Zchn"/>
-    <w:basedOn w:val="Absatz-Standardschriftart"/>
-    <w:link w:val="Zitat"/>
+  <w:style w:type="character" w:customStyle="1" w:styleId="QuoteChar">
+    <w:name w:val="Quote Char"/>
+    <w:basedOn w:val="DefaultParagraphFont"/>
+    <w:link w:val="Quote"/>
     <w:uiPriority w:val="29"/>
     <w:rsid w:val="001C76E9"/>
     <w:rPr>
@@ -4145,9 +4145,9 @@
       <w:color w:val="404040" w:themeColor="text1" w:themeTint="BF"/>
     </w:rPr>
   </w:style>
-  <w:style w:type="paragraph" w:styleId="Listenabsatz">
+  <w:style w:type="paragraph" w:styleId="ListParagraph">
     <w:name w:val="List Paragraph"/>
-    <w:basedOn w:val="Standard"/>
+    <w:basedOn w:val="Normal"/>
     <w:uiPriority w:val="34"/>
     <w:qFormat/>
     <w:rsid w:val="001C76E9"/>
@@ -4156,9 +4156,9 @@
       <w:contextualSpacing/>
     </w:pPr>
   </w:style>
-  <w:style w:type="character" w:styleId="IntensiveHervorhebung">
+  <w:style w:type="character" w:styleId="IntenseEmphasis">
     <w:name w:val="Intense Emphasis"/>
-    <w:basedOn w:val="Absatz-Standardschriftart"/>
+    <w:basedOn w:val="DefaultParagraphFont"/>
     <w:uiPriority w:val="21"/>
     <w:qFormat/>
     <w:rsid w:val="001C76E9"/>
@@ -4168,11 +4168,11 @@
       <w:color w:val="0F4761" w:themeColor="accent1" w:themeShade="BF"/>
     </w:rPr>
   </w:style>
-  <w:style w:type="paragraph" w:styleId="IntensivesZitat">
+  <w:style w:type="paragraph" w:styleId="IntenseQuote">
     <w:name w:val="Intense Quote"/>
-    <w:basedOn w:val="Standard"/>
-    <w:next w:val="Standard"/>
-    <w:link w:val="IntensivesZitatZchn"/>
+    <w:basedOn w:val="Normal"/>
+    <w:next w:val="Normal"/>
+    <w:link w:val="IntenseQuoteChar"/>
     <w:uiPriority w:val="30"/>
     <w:qFormat/>
     <w:rsid w:val="001C76E9"/>
@@ -4191,10 +4191,10 @@
       <w:color w:val="0F4761" w:themeColor="accent1" w:themeShade="BF"/>
     </w:rPr>
   </w:style>
-  <w:style w:type="character" w:customStyle="1" w:styleId="IntensivesZitatZchn">
-    <w:name w:val="Intensives Zitat Zchn"/>
-    <w:basedOn w:val="Absatz-Standardschriftart"/>
-    <w:link w:val="IntensivesZitat"/>
+  <w:style w:type="character" w:customStyle="1" w:styleId="IntenseQuoteChar">
+    <w:name w:val="Intense Quote Char"/>
+    <w:basedOn w:val="DefaultParagraphFont"/>
+    <w:link w:val="IntenseQuote"/>
     <w:uiPriority w:val="30"/>
     <w:rsid w:val="001C76E9"/>
     <w:rPr>
@@ -4203,9 +4203,9 @@
       <w:color w:val="0F4761" w:themeColor="accent1" w:themeShade="BF"/>
     </w:rPr>
   </w:style>
-  <w:style w:type="character" w:styleId="IntensiverVerweis">
+  <w:style w:type="character" w:styleId="IntenseReference">
     <w:name w:val="Intense Reference"/>
-    <w:basedOn w:val="Absatz-Standardschriftart"/>
+    <w:basedOn w:val="DefaultParagraphFont"/>
     <w:uiPriority w:val="32"/>
     <w:qFormat/>
     <w:rsid w:val="001C76E9"/>
@@ -4217,10 +4217,10 @@
       <w:spacing w:val="5"/>
     </w:rPr>
   </w:style>
-  <w:style w:type="paragraph" w:styleId="Kopfzeile">
+  <w:style w:type="paragraph" w:styleId="Header">
     <w:name w:val="header"/>
-    <w:basedOn w:val="Standard"/>
-    <w:link w:val="KopfzeileZchn"/>
+    <w:basedOn w:val="Normal"/>
+    <w:link w:val="HeaderChar"/>
     <w:uiPriority w:val="99"/>
     <w:unhideWhenUsed/>
     <w:rsid w:val="001C76E9"/>
@@ -4231,17 +4231,17 @@
       </w:tabs>
     </w:pPr>
   </w:style>
-  <w:style w:type="character" w:customStyle="1" w:styleId="KopfzeileZchn">
-    <w:name w:val="Kopfzeile Zchn"/>
-    <w:basedOn w:val="Absatz-Standardschriftart"/>
-    <w:link w:val="Kopfzeile"/>
+  <w:style w:type="character" w:customStyle="1" w:styleId="HeaderChar">
+    <w:name w:val="Header Char"/>
+    <w:basedOn w:val="DefaultParagraphFont"/>
+    <w:link w:val="Header"/>
     <w:uiPriority w:val="99"/>
     <w:rsid w:val="001C76E9"/>
   </w:style>
-  <w:style w:type="paragraph" w:styleId="Fuzeile">
+  <w:style w:type="paragraph" w:styleId="Footer">
     <w:name w:val="footer"/>
-    <w:basedOn w:val="Standard"/>
-    <w:link w:val="FuzeileZchn"/>
+    <w:basedOn w:val="Normal"/>
+    <w:link w:val="FooterChar"/>
     <w:uiPriority w:val="99"/>
     <w:unhideWhenUsed/>
     <w:rsid w:val="001C76E9"/>
@@ -4252,16 +4252,16 @@
       </w:tabs>
     </w:pPr>
   </w:style>
-  <w:style w:type="character" w:customStyle="1" w:styleId="FuzeileZchn">
-    <w:name w:val="Fußzeile Zchn"/>
-    <w:basedOn w:val="Absatz-Standardschriftart"/>
-    <w:link w:val="Fuzeile"/>
+  <w:style w:type="character" w:customStyle="1" w:styleId="FooterChar">
+    <w:name w:val="Footer Char"/>
+    <w:basedOn w:val="DefaultParagraphFont"/>
+    <w:link w:val="Footer"/>
     <w:uiPriority w:val="99"/>
     <w:rsid w:val="001C76E9"/>
   </w:style>
-  <w:style w:type="table" w:styleId="Tabellenraster">
+  <w:style w:type="table" w:styleId="TableGrid">
     <w:name w:val="Table Grid"/>
-    <w:basedOn w:val="NormaleTabelle"/>
+    <w:basedOn w:val="TableNormal"/>
     <w:uiPriority w:val="59"/>
     <w:rsid w:val="001A5F1F"/>
     <w:tblPr>
@@ -4277,7 +4277,7 @@
   </w:style>
   <w:style w:type="character" w:styleId="Hyperlink">
     <w:name w:val="Hyperlink"/>
-    <w:basedOn w:val="Absatz-Standardschriftart"/>
+    <w:basedOn w:val="DefaultParagraphFont"/>
     <w:uiPriority w:val="99"/>
     <w:unhideWhenUsed/>
     <w:rsid w:val="006957D1"/>
@@ -4286,9 +4286,9 @@
       <w:u w:val="single"/>
     </w:rPr>
   </w:style>
-  <w:style w:type="character" w:styleId="NichtaufgelsteErwhnung">
+  <w:style w:type="character" w:styleId="UnresolvedMention">
     <w:name w:val="Unresolved Mention"/>
-    <w:basedOn w:val="Absatz-Standardschriftart"/>
+    <w:basedOn w:val="DefaultParagraphFont"/>
     <w:uiPriority w:val="99"/>
     <w:semiHidden/>
     <w:unhideWhenUsed/>
@@ -4298,9 +4298,9 @@
       <w:shd w:val="clear" w:color="auto" w:fill="E1DFDD"/>
     </w:rPr>
   </w:style>
-  <w:style w:type="table" w:styleId="TabellemithellemGitternetz">
+  <w:style w:type="table" w:styleId="TableGridLight">
     <w:name w:val="Grid Table Light"/>
-    <w:basedOn w:val="NormaleTabelle"/>
+    <w:basedOn w:val="TableNormal"/>
     <w:uiPriority w:val="40"/>
     <w:rsid w:val="00913373"/>
     <w:tblPr>
@@ -4314,10 +4314,10 @@
       </w:tblBorders>
     </w:tblPr>
   </w:style>
-  <w:style w:type="paragraph" w:styleId="Kommentartext">
+  <w:style w:type="paragraph" w:styleId="CommentText">
     <w:name w:val="annotation text"/>
-    <w:basedOn w:val="Standard"/>
-    <w:link w:val="KommentartextZchn"/>
+    <w:basedOn w:val="Normal"/>
+    <w:link w:val="CommentTextChar"/>
     <w:uiPriority w:val="99"/>
     <w:semiHidden/>
     <w:unhideWhenUsed/>
@@ -4327,10 +4327,10 @@
       <w:szCs w:val="20"/>
     </w:rPr>
   </w:style>
-  <w:style w:type="character" w:customStyle="1" w:styleId="KommentartextZchn">
-    <w:name w:val="Kommentartext Zchn"/>
-    <w:basedOn w:val="Absatz-Standardschriftart"/>
-    <w:link w:val="Kommentartext"/>
+  <w:style w:type="character" w:customStyle="1" w:styleId="CommentTextChar">
+    <w:name w:val="Comment Text Char"/>
+    <w:basedOn w:val="DefaultParagraphFont"/>
+    <w:link w:val="CommentText"/>
     <w:uiPriority w:val="99"/>
     <w:semiHidden/>
     <w:rsid w:val="008F7950"/>
@@ -4339,9 +4339,9 @@
       <w:szCs w:val="20"/>
     </w:rPr>
   </w:style>
-  <w:style w:type="character" w:styleId="Kommentarzeichen">
+  <w:style w:type="character" w:styleId="CommentReference">
     <w:name w:val="annotation reference"/>
-    <w:basedOn w:val="Absatz-Standardschriftart"/>
+    <w:basedOn w:val="DefaultParagraphFont"/>
     <w:uiPriority w:val="99"/>
     <w:semiHidden/>
     <w:unhideWhenUsed/>

</xml_diff>